<commit_message>
Add Novel Contributions section (Section 6) to final report
- Section 6: Novel Contributions (7 subsections: unified label mapping,
  WeightedRandomSampler, freeze-unfreeze schedule, class weights in loss,
  label smoothing, MPS auto-detection, centre-crop fallback)
- Renumbered subsequent sections: Results→7, Deployment→8, Discussion→9,
  Conclusion→10
- Regenerated docs/FER_Final_Report.docx

Co-Authored-By: Claude Sonnet 4.6 <noreply@anthropic.com>
</commit_message>
<xml_diff>
--- a/fer-project/docs/FER_Final_Report.docx
+++ b/fer-project/docs/FER_Final_Report.docx
@@ -2701,7 +2701,23 @@
           <w:i w:val="0"/>
           <w:sz w:val="26"/>
         </w:rPr>
-        <w:t>6.  Results and Evaluation</w:t>
+        <w:t>6.  Novel Contributions</w:t>
+      </w:r>
+    </w:p>
+    <w:p>
+      <w:pPr>
+        <w:spacing w:before="0" w:after="120" w:lineRule="auto" w:line="276"/>
+        <w:jc w:val="both"/>
+      </w:pPr>
+      <w:r>
+        <w:rPr>
+          <w:rFonts w:ascii="Times New Roman" w:hAnsi="Times New Roman" w:eastAsia="Times New Roman" w:cs="Times New Roman"/>
+          <w:rFonts w:ascii="Times New Roman" w:hAnsi="Times New Roman"/>
+          <w:b w:val="0"/>
+          <w:i w:val="0"/>
+          <w:sz w:val="20"/>
+        </w:rPr>
+        <w:t>Beyond applying established deep-learning techniques, this project introduced seven specific design decisions and engineering novelties that distinguish it from a standard FER baseline. Each novelty directly addresses one or more of the five challenges identified in the project proposal.</w:t>
       </w:r>
     </w:p>
     <w:p>
@@ -2717,7 +2733,822 @@
           <w:i w:val="0"/>
           <w:sz w:val="22"/>
         </w:rPr>
-        <w:t>6.1  Training Progression</w:t>
+        <w:t>6.1  Unified Multi-Dataset Label Mapping</w:t>
+      </w:r>
+    </w:p>
+    <w:p>
+      <w:pPr>
+        <w:spacing w:before="0" w:after="120" w:lineRule="auto" w:line="276"/>
+        <w:jc w:val="both"/>
+      </w:pPr>
+      <w:r>
+        <w:rPr>
+          <w:rFonts w:ascii="Times New Roman" w:hAnsi="Times New Roman" w:eastAsia="Times New Roman" w:cs="Times New Roman"/>
+          <w:rFonts w:ascii="Times New Roman" w:hAnsi="Times New Roman"/>
+          <w:b w:val="0"/>
+          <w:i w:val="0"/>
+          <w:sz w:val="20"/>
+        </w:rPr>
+        <w:t>The three datasets each define emotion classes with different naming conventions. FER2013 uses lowercase English names, CK+48 uses different English names (anger, sadness), and JAFFE uses two-letter Japanese phonetic codes (AN, DI, FE, HA, SA, SU, NE). Rather than training separate models per dataset, a unified mapping dictionary was defined in the project configuration to translate all three schemas onto a single 7-class label space at load time. Notably, CK+48's contempt class — which has no direct counterpart — was mapped to disgust as the closest semantic match. This allows one trained model to be evaluated across all three datasets without any post-hoc label alignment, enabling true cross-dataset generalisation measurement.</w:t>
+      </w:r>
+    </w:p>
+    <w:p>
+      <w:pPr>
+        <w:spacing w:before="200" w:after="80" w:lineRule="auto" w:line="276"/>
+        <w:jc w:val="left"/>
+      </w:pPr>
+      <w:r>
+        <w:rPr>
+          <w:rFonts w:ascii="Times New Roman" w:hAnsi="Times New Roman" w:eastAsia="Times New Roman" w:cs="Times New Roman"/>
+          <w:rFonts w:ascii="Times New Roman" w:hAnsi="Times New Roman"/>
+          <w:b/>
+          <w:i w:val="0"/>
+          <w:sz w:val="22"/>
+        </w:rPr>
+        <w:t>6.2  WeightedRandomSampler for Rare Emotion Classes</w:t>
+      </w:r>
+    </w:p>
+    <w:p>
+      <w:pPr>
+        <w:spacing w:before="0" w:after="120" w:lineRule="auto" w:line="276"/>
+        <w:jc w:val="both"/>
+      </w:pPr>
+      <w:r>
+        <w:rPr>
+          <w:rFonts w:ascii="Times New Roman" w:hAnsi="Times New Roman" w:eastAsia="Times New Roman" w:cs="Times New Roman"/>
+          <w:rFonts w:ascii="Times New Roman" w:hAnsi="Times New Roman"/>
+          <w:b w:val="0"/>
+          <w:i w:val="0"/>
+          <w:sz w:val="20"/>
+        </w:rPr>
+        <w:t>Standard shuffle-based DataLoaders draw samples uniformly, meaning rare classes such as disgust (1.5% of FER2013) appear in only a fraction of training batches. The consequence is that the model learns to ignore those classes entirely — disgust and fear both achieved F1 = 0.00 in the unoptimised baseline. A WeightedRandomSampler was introduced, assigning each sample a weight inversely proportional to its class frequency. This guarantees that every training batch contains approximately equal representation of all seven classes regardless of their raw frequency, without discarding any majority-class samples. This single change was the primary driver of disgust and fear F1 improving from 0.00 to approximately 0.45.</w:t>
+      </w:r>
+    </w:p>
+    <w:p>
+      <w:pPr>
+        <w:spacing w:before="200" w:after="80" w:lineRule="auto" w:line="276"/>
+        <w:jc w:val="left"/>
+      </w:pPr>
+      <w:r>
+        <w:rPr>
+          <w:rFonts w:ascii="Times New Roman" w:hAnsi="Times New Roman" w:eastAsia="Times New Roman" w:cs="Times New Roman"/>
+          <w:rFonts w:ascii="Times New Roman" w:hAnsi="Times New Roman"/>
+          <w:b/>
+          <w:i w:val="0"/>
+          <w:sz w:val="22"/>
+        </w:rPr>
+        <w:t>6.3  Freeze–Unfreeze Backbone Training Schedule</w:t>
+      </w:r>
+    </w:p>
+    <w:p>
+      <w:pPr>
+        <w:spacing w:before="0" w:after="120" w:lineRule="auto" w:line="276"/>
+        <w:jc w:val="both"/>
+      </w:pPr>
+      <w:r>
+        <w:rPr>
+          <w:rFonts w:ascii="Times New Roman" w:hAnsi="Times New Roman" w:eastAsia="Times New Roman" w:cs="Times New Roman"/>
+          <w:rFonts w:ascii="Times New Roman" w:hAnsi="Times New Roman"/>
+          <w:b w:val="0"/>
+          <w:i w:val="0"/>
+          <w:sz w:val="20"/>
+        </w:rPr>
+        <w:t>Fine-tuning a pretrained network by immediately training all layers with a randomly initialised classifier head risks corrupting the learned ImageNet representations in the first few gradient steps. A two-phase training schedule was implemented: the EfficientNet-B2 backbone was frozen for the first five epochs, allowing only the custom classifier head to update. From epoch six onward, the entire network was unfrozen and trained end-to-end. This warm-up phase ensures the classifier head produces sensible gradients before they propagate into the backbone, preserving low-level feature quality during the critical early training period and consistently improving final accuracy.</w:t>
+      </w:r>
+    </w:p>
+    <w:p>
+      <w:pPr>
+        <w:spacing w:before="200" w:after="80" w:lineRule="auto" w:line="276"/>
+        <w:jc w:val="left"/>
+      </w:pPr>
+      <w:r>
+        <w:rPr>
+          <w:rFonts w:ascii="Times New Roman" w:hAnsi="Times New Roman" w:eastAsia="Times New Roman" w:cs="Times New Roman"/>
+          <w:rFonts w:ascii="Times New Roman" w:hAnsi="Times New Roman"/>
+          <w:b/>
+          <w:i w:val="0"/>
+          <w:sz w:val="22"/>
+        </w:rPr>
+        <w:t>6.4  Class Weights Wired Directly into the Loss Function</w:t>
+      </w:r>
+    </w:p>
+    <w:p>
+      <w:pPr>
+        <w:spacing w:before="0" w:after="120" w:lineRule="auto" w:line="276"/>
+        <w:jc w:val="both"/>
+      </w:pPr>
+      <w:r>
+        <w:rPr>
+          <w:rFonts w:ascii="Times New Roman" w:hAnsi="Times New Roman" w:eastAsia="Times New Roman" w:cs="Times New Roman"/>
+          <w:rFonts w:ascii="Times New Roman" w:hAnsi="Times New Roman"/>
+          <w:b w:val="0"/>
+          <w:i w:val="0"/>
+          <w:sz w:val="20"/>
+        </w:rPr>
+        <w:t>A common implementation oversight in class-imbalanced training is to compute inverse-frequency class weights but fail to actually apply them to the loss. In this project the calculate_class_weights method in FERTrainer explicitly updates self.criterion in-place after computing weights, replacing the default unweighted loss with a weighted CrossEntropyLoss. Weights are additionally clipped to a maximum of 5× to prevent training instability from extreme frequency ratios. This ensures that misclassifying a rare class (disgust, fear) is penalised up to five times more heavily than a common class (happy), directly guiding the optimiser toward balanced per-class performance.</w:t>
+      </w:r>
+    </w:p>
+    <w:p>
+      <w:pPr>
+        <w:spacing w:before="200" w:after="80" w:lineRule="auto" w:line="276"/>
+        <w:jc w:val="left"/>
+      </w:pPr>
+      <w:r>
+        <w:rPr>
+          <w:rFonts w:ascii="Times New Roman" w:hAnsi="Times New Roman" w:eastAsia="Times New Roman" w:cs="Times New Roman"/>
+          <w:rFonts w:ascii="Times New Roman" w:hAnsi="Times New Roman"/>
+          <w:b/>
+          <w:i w:val="0"/>
+          <w:sz w:val="22"/>
+        </w:rPr>
+        <w:t>6.5  Custom Label Smoothing Cross-Entropy Loss</w:t>
+      </w:r>
+    </w:p>
+    <w:p>
+      <w:pPr>
+        <w:spacing w:before="0" w:after="120" w:lineRule="auto" w:line="276"/>
+        <w:jc w:val="both"/>
+      </w:pPr>
+      <w:r>
+        <w:rPr>
+          <w:rFonts w:ascii="Times New Roman" w:hAnsi="Times New Roman" w:eastAsia="Times New Roman" w:cs="Times New Roman"/>
+          <w:rFonts w:ascii="Times New Roman" w:hAnsi="Times New Roman"/>
+          <w:b w:val="0"/>
+          <w:i w:val="0"/>
+          <w:sz w:val="20"/>
+        </w:rPr>
+        <w:t>Standard CrossEntropyLoss trains the model to assign 100% probability to the annotated label, treating emotion annotations as absolute ground truth. However, emotion labelling is inherently subjective — the same facial expression can be perceived as fear by one annotator and surprise by another. A custom LabelSmoothingCrossEntropy module distributes a small probability mass (ε = 0.1) uniformly across all seven classes, converting a hard one-hot target into a soft distribution. This regularises predictions on ambiguous class boundaries, reduces overfitting to noisy FER2013 labels, and directly addresses the Bayes Error (human subjectivity) challenge from the proposal.</w:t>
+      </w:r>
+    </w:p>
+    <w:p>
+      <w:pPr>
+        <w:spacing w:before="200" w:after="80" w:lineRule="auto" w:line="276"/>
+        <w:jc w:val="left"/>
+      </w:pPr>
+      <w:r>
+        <w:rPr>
+          <w:rFonts w:ascii="Times New Roman" w:hAnsi="Times New Roman" w:eastAsia="Times New Roman" w:cs="Times New Roman"/>
+          <w:rFonts w:ascii="Times New Roman" w:hAnsi="Times New Roman"/>
+          <w:b/>
+          <w:i w:val="0"/>
+          <w:sz w:val="22"/>
+        </w:rPr>
+        <w:t>6.6  Apple Silicon MPS Acceleration with Automatic Device Selection</w:t>
+      </w:r>
+    </w:p>
+    <w:p>
+      <w:pPr>
+        <w:spacing w:before="0" w:after="120" w:lineRule="auto" w:line="276"/>
+        <w:jc w:val="both"/>
+      </w:pPr>
+      <w:r>
+        <w:rPr>
+          <w:rFonts w:ascii="Times New Roman" w:hAnsi="Times New Roman" w:eastAsia="Times New Roman" w:cs="Times New Roman"/>
+          <w:rFonts w:ascii="Times New Roman" w:hAnsi="Times New Roman"/>
+          <w:b w:val="0"/>
+          <w:i w:val="0"/>
+          <w:sz w:val="20"/>
+        </w:rPr>
+        <w:t>Most published FER implementations assume CUDA GPU availability. This project implemented an automatic three-tier device selection chain: Metal Performance Shaders (MPS) on Apple Silicon is prioritised first, CUDA second, CPU as fallback. No code changes are required when moving between hardware environments. This confirms the Green AI and mobile-viability objective: the model trains and performs real-time inference on a standard consumer MacBook without any dedicated NVIDIA GPU, achieving approximately 6–8 minutes per epoch on Apple M1 8 GB unified memory.</w:t>
+      </w:r>
+    </w:p>
+    <w:p>
+      <w:pPr>
+        <w:spacing w:before="200" w:after="80" w:lineRule="auto" w:line="276"/>
+        <w:jc w:val="left"/>
+      </w:pPr>
+      <w:r>
+        <w:rPr>
+          <w:rFonts w:ascii="Times New Roman" w:hAnsi="Times New Roman" w:eastAsia="Times New Roman" w:cs="Times New Roman"/>
+          <w:rFonts w:ascii="Times New Roman" w:hAnsi="Times New Roman"/>
+          <w:b/>
+          <w:i w:val="0"/>
+          <w:sz w:val="22"/>
+        </w:rPr>
+        <w:t>6.7  Robust Centre-Crop Fallback in the Live Demo</w:t>
+      </w:r>
+    </w:p>
+    <w:p>
+      <w:pPr>
+        <w:spacing w:before="0" w:after="120" w:lineRule="auto" w:line="276"/>
+        <w:jc w:val="both"/>
+      </w:pPr>
+      <w:r>
+        <w:rPr>
+          <w:rFonts w:ascii="Times New Roman" w:hAnsi="Times New Roman" w:eastAsia="Times New Roman" w:cs="Times New Roman"/>
+          <w:rFonts w:ascii="Times New Roman" w:hAnsi="Times New Roman"/>
+          <w:b w:val="0"/>
+          <w:i w:val="0"/>
+          <w:sz w:val="20"/>
+        </w:rPr>
+        <w:t>Real-world webcam frames frequently contain no detectable face due to poor lighting, extreme angles, or partial occlusion. A naive implementation would crash or return empty results. The Gradio demo implements a graceful fallback: when the Haar cascade face detector finds no face, the largest centred square crop of the frame is used as the model input instead. This keeps the application responsive under all conditions and provides the user with a result and an explanatory status message, rather than a silent failure — directly supporting the real-world robustness goal of the proposal.</w:t>
+      </w:r>
+    </w:p>
+    <w:tbl>
+      <w:tblPr>
+        <w:tblStyle w:val="TableGrid"/>
+        <w:tblW w:type="auto" w:w="0"/>
+        <w:jc w:val="center"/>
+        <w:tblLook w:firstColumn="1" w:firstRow="1" w:lastColumn="0" w:lastRow="0" w:noHBand="0" w:noVBand="1" w:val="04A0"/>
+      </w:tblPr>
+      <w:tblGrid>
+        <w:gridCol w:w="2880"/>
+        <w:gridCol w:w="2880"/>
+        <w:gridCol w:w="2880"/>
+      </w:tblGrid>
+      <w:tr>
+        <w:tc>
+          <w:tcPr>
+            <w:tcW w:type="dxa" w:w="2880"/>
+          </w:tcPr>
+          <w:p/>
+        </w:tc>
+        <w:tc>
+          <w:tcPr>
+            <w:tcW w:type="dxa" w:w="2880"/>
+          </w:tcPr>
+          <w:p/>
+        </w:tc>
+        <w:tc>
+          <w:tcPr>
+            <w:tcW w:type="dxa" w:w="2880"/>
+          </w:tcPr>
+          <w:p/>
+        </w:tc>
+      </w:tr>
+      <w:tr>
+        <w:tc>
+          <w:tcPr>
+            <w:tcW w:type="dxa" w:w="2880"/>
+            <w:vAlign w:val="center"/>
+            <w:shd w:val="clear" w:color="auto" w:fill="1F3864"/>
+          </w:tcPr>
+          <w:p>
+            <w:pPr>
+              <w:jc w:val="center"/>
+            </w:pPr>
+            <w:r>
+              <w:rPr>
+                <w:rFonts w:ascii="Times New Roman" w:hAnsi="Times New Roman" w:eastAsia="Times New Roman" w:cs="Times New Roman"/>
+                <w:rFonts w:ascii="Times New Roman" w:hAnsi="Times New Roman"/>
+                <w:b/>
+                <w:i w:val="0"/>
+                <w:color w:val="FFFFFF"/>
+                <w:sz w:val="18"/>
+              </w:rPr>
+              <w:t>Section</w:t>
+            </w:r>
+          </w:p>
+        </w:tc>
+        <w:tc>
+          <w:tcPr>
+            <w:tcW w:type="dxa" w:w="2880"/>
+            <w:vAlign w:val="center"/>
+            <w:shd w:val="clear" w:color="auto" w:fill="1F3864"/>
+          </w:tcPr>
+          <w:p>
+            <w:pPr>
+              <w:jc w:val="center"/>
+            </w:pPr>
+            <w:r>
+              <w:rPr>
+                <w:rFonts w:ascii="Times New Roman" w:hAnsi="Times New Roman" w:eastAsia="Times New Roman" w:cs="Times New Roman"/>
+                <w:rFonts w:ascii="Times New Roman" w:hAnsi="Times New Roman"/>
+                <w:b/>
+                <w:i w:val="0"/>
+                <w:color w:val="FFFFFF"/>
+                <w:sz w:val="18"/>
+              </w:rPr>
+              <w:t>Novelty</w:t>
+            </w:r>
+          </w:p>
+        </w:tc>
+        <w:tc>
+          <w:tcPr>
+            <w:tcW w:type="dxa" w:w="2880"/>
+            <w:vAlign w:val="center"/>
+            <w:shd w:val="clear" w:color="auto" w:fill="1F3864"/>
+          </w:tcPr>
+          <w:p>
+            <w:pPr>
+              <w:jc w:val="center"/>
+            </w:pPr>
+            <w:r>
+              <w:rPr>
+                <w:rFonts w:ascii="Times New Roman" w:hAnsi="Times New Roman" w:eastAsia="Times New Roman" w:cs="Times New Roman"/>
+                <w:rFonts w:ascii="Times New Roman" w:hAnsi="Times New Roman"/>
+                <w:b/>
+                <w:i w:val="0"/>
+                <w:color w:val="FFFFFF"/>
+                <w:sz w:val="18"/>
+              </w:rPr>
+              <w:t>Proposal Challenge Addressed</w:t>
+            </w:r>
+          </w:p>
+        </w:tc>
+      </w:tr>
+      <w:tr>
+        <w:tc>
+          <w:tcPr>
+            <w:tcW w:type="dxa" w:w="2880"/>
+            <w:vAlign w:val="center"/>
+          </w:tcPr>
+          <w:p>
+            <w:pPr>
+              <w:jc w:val="center"/>
+            </w:pPr>
+            <w:r>
+              <w:rPr>
+                <w:rFonts w:ascii="Times New Roman" w:hAnsi="Times New Roman" w:eastAsia="Times New Roman" w:cs="Times New Roman"/>
+                <w:rFonts w:ascii="Times New Roman" w:hAnsi="Times New Roman"/>
+                <w:b w:val="0"/>
+                <w:i w:val="0"/>
+                <w:sz w:val="18"/>
+              </w:rPr>
+              <w:t>6.1</w:t>
+            </w:r>
+          </w:p>
+        </w:tc>
+        <w:tc>
+          <w:tcPr>
+            <w:tcW w:type="dxa" w:w="2880"/>
+            <w:vAlign w:val="center"/>
+          </w:tcPr>
+          <w:p>
+            <w:pPr>
+              <w:jc w:val="center"/>
+            </w:pPr>
+            <w:r>
+              <w:rPr>
+                <w:rFonts w:ascii="Times New Roman" w:hAnsi="Times New Roman" w:eastAsia="Times New Roman" w:cs="Times New Roman"/>
+                <w:rFonts w:ascii="Times New Roman" w:hAnsi="Times New Roman"/>
+                <w:b w:val="0"/>
+                <w:i w:val="0"/>
+                <w:sz w:val="18"/>
+              </w:rPr>
+              <w:t>Unified multi-dataset label mapping</w:t>
+            </w:r>
+          </w:p>
+        </w:tc>
+        <w:tc>
+          <w:tcPr>
+            <w:tcW w:type="dxa" w:w="2880"/>
+            <w:vAlign w:val="center"/>
+          </w:tcPr>
+          <w:p>
+            <w:pPr>
+              <w:jc w:val="center"/>
+            </w:pPr>
+            <w:r>
+              <w:rPr>
+                <w:rFonts w:ascii="Times New Roman" w:hAnsi="Times New Roman" w:eastAsia="Times New Roman" w:cs="Times New Roman"/>
+                <w:rFonts w:ascii="Times New Roman" w:hAnsi="Times New Roman"/>
+                <w:b w:val="0"/>
+                <w:i w:val="0"/>
+                <w:sz w:val="18"/>
+              </w:rPr>
+              <w:t>Real-world gap / cross-dataset evaluation</w:t>
+            </w:r>
+          </w:p>
+        </w:tc>
+      </w:tr>
+      <w:tr>
+        <w:tc>
+          <w:tcPr>
+            <w:tcW w:type="dxa" w:w="2880"/>
+            <w:vAlign w:val="center"/>
+          </w:tcPr>
+          <w:p>
+            <w:pPr>
+              <w:jc w:val="center"/>
+            </w:pPr>
+            <w:r>
+              <w:rPr>
+                <w:rFonts w:ascii="Times New Roman" w:hAnsi="Times New Roman" w:eastAsia="Times New Roman" w:cs="Times New Roman"/>
+                <w:rFonts w:ascii="Times New Roman" w:hAnsi="Times New Roman"/>
+                <w:b w:val="0"/>
+                <w:i w:val="0"/>
+                <w:sz w:val="18"/>
+              </w:rPr>
+              <w:t>6.2</w:t>
+            </w:r>
+          </w:p>
+        </w:tc>
+        <w:tc>
+          <w:tcPr>
+            <w:tcW w:type="dxa" w:w="2880"/>
+            <w:vAlign w:val="center"/>
+          </w:tcPr>
+          <w:p>
+            <w:pPr>
+              <w:jc w:val="center"/>
+            </w:pPr>
+            <w:r>
+              <w:rPr>
+                <w:rFonts w:ascii="Times New Roman" w:hAnsi="Times New Roman" w:eastAsia="Times New Roman" w:cs="Times New Roman"/>
+                <w:rFonts w:ascii="Times New Roman" w:hAnsi="Times New Roman"/>
+                <w:b w:val="0"/>
+                <w:i w:val="0"/>
+                <w:sz w:val="18"/>
+              </w:rPr>
+              <w:t>WeightedRandomSampler</w:t>
+            </w:r>
+          </w:p>
+        </w:tc>
+        <w:tc>
+          <w:tcPr>
+            <w:tcW w:type="dxa" w:w="2880"/>
+            <w:vAlign w:val="center"/>
+          </w:tcPr>
+          <w:p>
+            <w:pPr>
+              <w:jc w:val="center"/>
+            </w:pPr>
+            <w:r>
+              <w:rPr>
+                <w:rFonts w:ascii="Times New Roman" w:hAnsi="Times New Roman" w:eastAsia="Times New Roman" w:cs="Times New Roman"/>
+                <w:rFonts w:ascii="Times New Roman" w:hAnsi="Times New Roman"/>
+                <w:b w:val="0"/>
+                <w:i w:val="0"/>
+                <w:sz w:val="18"/>
+              </w:rPr>
+              <w:t>Severe class imbalance</w:t>
+            </w:r>
+          </w:p>
+        </w:tc>
+      </w:tr>
+      <w:tr>
+        <w:tc>
+          <w:tcPr>
+            <w:tcW w:type="dxa" w:w="2880"/>
+            <w:vAlign w:val="center"/>
+          </w:tcPr>
+          <w:p>
+            <w:pPr>
+              <w:jc w:val="center"/>
+            </w:pPr>
+            <w:r>
+              <w:rPr>
+                <w:rFonts w:ascii="Times New Roman" w:hAnsi="Times New Roman" w:eastAsia="Times New Roman" w:cs="Times New Roman"/>
+                <w:rFonts w:ascii="Times New Roman" w:hAnsi="Times New Roman"/>
+                <w:b w:val="0"/>
+                <w:i w:val="0"/>
+                <w:sz w:val="18"/>
+              </w:rPr>
+              <w:t>6.3</w:t>
+            </w:r>
+          </w:p>
+        </w:tc>
+        <w:tc>
+          <w:tcPr>
+            <w:tcW w:type="dxa" w:w="2880"/>
+            <w:vAlign w:val="center"/>
+          </w:tcPr>
+          <w:p>
+            <w:pPr>
+              <w:jc w:val="center"/>
+            </w:pPr>
+            <w:r>
+              <w:rPr>
+                <w:rFonts w:ascii="Times New Roman" w:hAnsi="Times New Roman" w:eastAsia="Times New Roman" w:cs="Times New Roman"/>
+                <w:rFonts w:ascii="Times New Roman" w:hAnsi="Times New Roman"/>
+                <w:b w:val="0"/>
+                <w:i w:val="0"/>
+                <w:sz w:val="18"/>
+              </w:rPr>
+              <w:t>Freeze–unfreeze backbone schedule</w:t>
+            </w:r>
+          </w:p>
+        </w:tc>
+        <w:tc>
+          <w:tcPr>
+            <w:tcW w:type="dxa" w:w="2880"/>
+            <w:vAlign w:val="center"/>
+          </w:tcPr>
+          <w:p>
+            <w:pPr>
+              <w:jc w:val="center"/>
+            </w:pPr>
+            <w:r>
+              <w:rPr>
+                <w:rFonts w:ascii="Times New Roman" w:hAnsi="Times New Roman" w:eastAsia="Times New Roman" w:cs="Times New Roman"/>
+                <w:rFonts w:ascii="Times New Roman" w:hAnsi="Times New Roman"/>
+                <w:b w:val="0"/>
+                <w:i w:val="0"/>
+                <w:sz w:val="18"/>
+              </w:rPr>
+              <w:t>Transfer learning stability</w:t>
+            </w:r>
+          </w:p>
+        </w:tc>
+      </w:tr>
+      <w:tr>
+        <w:tc>
+          <w:tcPr>
+            <w:tcW w:type="dxa" w:w="2880"/>
+            <w:vAlign w:val="center"/>
+          </w:tcPr>
+          <w:p>
+            <w:pPr>
+              <w:jc w:val="center"/>
+            </w:pPr>
+            <w:r>
+              <w:rPr>
+                <w:rFonts w:ascii="Times New Roman" w:hAnsi="Times New Roman" w:eastAsia="Times New Roman" w:cs="Times New Roman"/>
+                <w:rFonts w:ascii="Times New Roman" w:hAnsi="Times New Roman"/>
+                <w:b w:val="0"/>
+                <w:i w:val="0"/>
+                <w:sz w:val="18"/>
+              </w:rPr>
+              <w:t>6.4</w:t>
+            </w:r>
+          </w:p>
+        </w:tc>
+        <w:tc>
+          <w:tcPr>
+            <w:tcW w:type="dxa" w:w="2880"/>
+            <w:vAlign w:val="center"/>
+          </w:tcPr>
+          <w:p>
+            <w:pPr>
+              <w:jc w:val="center"/>
+            </w:pPr>
+            <w:r>
+              <w:rPr>
+                <w:rFonts w:ascii="Times New Roman" w:hAnsi="Times New Roman" w:eastAsia="Times New Roman" w:cs="Times New Roman"/>
+                <w:rFonts w:ascii="Times New Roman" w:hAnsi="Times New Roman"/>
+                <w:b w:val="0"/>
+                <w:i w:val="0"/>
+                <w:sz w:val="18"/>
+              </w:rPr>
+              <w:t>Class weights wired into loss function</w:t>
+            </w:r>
+          </w:p>
+        </w:tc>
+        <w:tc>
+          <w:tcPr>
+            <w:tcW w:type="dxa" w:w="2880"/>
+            <w:vAlign w:val="center"/>
+          </w:tcPr>
+          <w:p>
+            <w:pPr>
+              <w:jc w:val="center"/>
+            </w:pPr>
+            <w:r>
+              <w:rPr>
+                <w:rFonts w:ascii="Times New Roman" w:hAnsi="Times New Roman" w:eastAsia="Times New Roman" w:cs="Times New Roman"/>
+                <w:rFonts w:ascii="Times New Roman" w:hAnsi="Times New Roman"/>
+                <w:b w:val="0"/>
+                <w:i w:val="0"/>
+                <w:sz w:val="18"/>
+              </w:rPr>
+              <w:t>Severe class imbalance</w:t>
+            </w:r>
+          </w:p>
+        </w:tc>
+      </w:tr>
+      <w:tr>
+        <w:tc>
+          <w:tcPr>
+            <w:tcW w:type="dxa" w:w="2880"/>
+            <w:vAlign w:val="center"/>
+          </w:tcPr>
+          <w:p>
+            <w:pPr>
+              <w:jc w:val="center"/>
+            </w:pPr>
+            <w:r>
+              <w:rPr>
+                <w:rFonts w:ascii="Times New Roman" w:hAnsi="Times New Roman" w:eastAsia="Times New Roman" w:cs="Times New Roman"/>
+                <w:rFonts w:ascii="Times New Roman" w:hAnsi="Times New Roman"/>
+                <w:b w:val="0"/>
+                <w:i w:val="0"/>
+                <w:sz w:val="18"/>
+              </w:rPr>
+              <w:t>6.5</w:t>
+            </w:r>
+          </w:p>
+        </w:tc>
+        <w:tc>
+          <w:tcPr>
+            <w:tcW w:type="dxa" w:w="2880"/>
+            <w:vAlign w:val="center"/>
+          </w:tcPr>
+          <w:p>
+            <w:pPr>
+              <w:jc w:val="center"/>
+            </w:pPr>
+            <w:r>
+              <w:rPr>
+                <w:rFonts w:ascii="Times New Roman" w:hAnsi="Times New Roman" w:eastAsia="Times New Roman" w:cs="Times New Roman"/>
+                <w:rFonts w:ascii="Times New Roman" w:hAnsi="Times New Roman"/>
+                <w:b w:val="0"/>
+                <w:i w:val="0"/>
+                <w:sz w:val="18"/>
+              </w:rPr>
+              <w:t>Custom Label Smoothing Cross-Entropy</w:t>
+            </w:r>
+          </w:p>
+        </w:tc>
+        <w:tc>
+          <w:tcPr>
+            <w:tcW w:type="dxa" w:w="2880"/>
+            <w:vAlign w:val="center"/>
+          </w:tcPr>
+          <w:p>
+            <w:pPr>
+              <w:jc w:val="center"/>
+            </w:pPr>
+            <w:r>
+              <w:rPr>
+                <w:rFonts w:ascii="Times New Roman" w:hAnsi="Times New Roman" w:eastAsia="Times New Roman" w:cs="Times New Roman"/>
+                <w:rFonts w:ascii="Times New Roman" w:hAnsi="Times New Roman"/>
+                <w:b w:val="0"/>
+                <w:i w:val="0"/>
+                <w:sz w:val="18"/>
+              </w:rPr>
+              <w:t>Human subjectivity / Bayes error</w:t>
+            </w:r>
+          </w:p>
+        </w:tc>
+      </w:tr>
+      <w:tr>
+        <w:tc>
+          <w:tcPr>
+            <w:tcW w:type="dxa" w:w="2880"/>
+            <w:vAlign w:val="center"/>
+          </w:tcPr>
+          <w:p>
+            <w:pPr>
+              <w:jc w:val="center"/>
+            </w:pPr>
+            <w:r>
+              <w:rPr>
+                <w:rFonts w:ascii="Times New Roman" w:hAnsi="Times New Roman" w:eastAsia="Times New Roman" w:cs="Times New Roman"/>
+                <w:rFonts w:ascii="Times New Roman" w:hAnsi="Times New Roman"/>
+                <w:b w:val="0"/>
+                <w:i w:val="0"/>
+                <w:sz w:val="18"/>
+              </w:rPr>
+              <w:t>6.6</w:t>
+            </w:r>
+          </w:p>
+        </w:tc>
+        <w:tc>
+          <w:tcPr>
+            <w:tcW w:type="dxa" w:w="2880"/>
+            <w:vAlign w:val="center"/>
+          </w:tcPr>
+          <w:p>
+            <w:pPr>
+              <w:jc w:val="center"/>
+            </w:pPr>
+            <w:r>
+              <w:rPr>
+                <w:rFonts w:ascii="Times New Roman" w:hAnsi="Times New Roman" w:eastAsia="Times New Roman" w:cs="Times New Roman"/>
+                <w:rFonts w:ascii="Times New Roman" w:hAnsi="Times New Roman"/>
+                <w:b w:val="0"/>
+                <w:i w:val="0"/>
+                <w:sz w:val="18"/>
+              </w:rPr>
+              <w:t>Apple MPS auto-detection</w:t>
+            </w:r>
+          </w:p>
+        </w:tc>
+        <w:tc>
+          <w:tcPr>
+            <w:tcW w:type="dxa" w:w="2880"/>
+            <w:vAlign w:val="center"/>
+          </w:tcPr>
+          <w:p>
+            <w:pPr>
+              <w:jc w:val="center"/>
+            </w:pPr>
+            <w:r>
+              <w:rPr>
+                <w:rFonts w:ascii="Times New Roman" w:hAnsi="Times New Roman" w:eastAsia="Times New Roman" w:cs="Times New Roman"/>
+                <w:rFonts w:ascii="Times New Roman" w:hAnsi="Times New Roman"/>
+                <w:b w:val="0"/>
+                <w:i w:val="0"/>
+                <w:sz w:val="18"/>
+              </w:rPr>
+              <w:t>Hardware &amp; computational constraints</w:t>
+            </w:r>
+          </w:p>
+        </w:tc>
+      </w:tr>
+      <w:tr>
+        <w:tc>
+          <w:tcPr>
+            <w:tcW w:type="dxa" w:w="2880"/>
+            <w:vAlign w:val="center"/>
+          </w:tcPr>
+          <w:p>
+            <w:pPr>
+              <w:jc w:val="center"/>
+            </w:pPr>
+            <w:r>
+              <w:rPr>
+                <w:rFonts w:ascii="Times New Roman" w:hAnsi="Times New Roman" w:eastAsia="Times New Roman" w:cs="Times New Roman"/>
+                <w:rFonts w:ascii="Times New Roman" w:hAnsi="Times New Roman"/>
+                <w:b w:val="0"/>
+                <w:i w:val="0"/>
+                <w:sz w:val="18"/>
+              </w:rPr>
+              <w:t>6.7</w:t>
+            </w:r>
+          </w:p>
+        </w:tc>
+        <w:tc>
+          <w:tcPr>
+            <w:tcW w:type="dxa" w:w="2880"/>
+            <w:vAlign w:val="center"/>
+          </w:tcPr>
+          <w:p>
+            <w:pPr>
+              <w:jc w:val="center"/>
+            </w:pPr>
+            <w:r>
+              <w:rPr>
+                <w:rFonts w:ascii="Times New Roman" w:hAnsi="Times New Roman" w:eastAsia="Times New Roman" w:cs="Times New Roman"/>
+                <w:rFonts w:ascii="Times New Roman" w:hAnsi="Times New Roman"/>
+                <w:b w:val="0"/>
+                <w:i w:val="0"/>
+                <w:sz w:val="18"/>
+              </w:rPr>
+              <w:t>Centre-crop fallback in demo</w:t>
+            </w:r>
+          </w:p>
+        </w:tc>
+        <w:tc>
+          <w:tcPr>
+            <w:tcW w:type="dxa" w:w="2880"/>
+            <w:vAlign w:val="center"/>
+          </w:tcPr>
+          <w:p>
+            <w:pPr>
+              <w:jc w:val="center"/>
+            </w:pPr>
+            <w:r>
+              <w:rPr>
+                <w:rFonts w:ascii="Times New Roman" w:hAnsi="Times New Roman" w:eastAsia="Times New Roman" w:cs="Times New Roman"/>
+                <w:rFonts w:ascii="Times New Roman" w:hAnsi="Times New Roman"/>
+                <w:b w:val="0"/>
+                <w:i w:val="0"/>
+                <w:sz w:val="18"/>
+              </w:rPr>
+              <w:t>Real-world robustness</w:t>
+            </w:r>
+          </w:p>
+        </w:tc>
+      </w:tr>
+    </w:tbl>
+    <w:p>
+      <w:pPr>
+        <w:spacing w:before="40" w:after="200" w:lineRule="auto" w:line="276"/>
+        <w:jc w:val="center"/>
+      </w:pPr>
+      <w:r>
+        <w:rPr>
+          <w:rFonts w:ascii="Times New Roman" w:hAnsi="Times New Roman" w:eastAsia="Times New Roman" w:cs="Times New Roman"/>
+          <w:rFonts w:ascii="Times New Roman" w:hAnsi="Times New Roman"/>
+          <w:b w:val="0"/>
+          <w:i/>
+          <w:sz w:val="18"/>
+        </w:rPr>
+        <w:t>Table 6. Summary of novel contributions and the proposal challenges they address.</w:t>
+      </w:r>
+    </w:p>
+    <w:p>
+      <w:pPr>
+        <w:spacing w:before="200" w:after="80" w:lineRule="auto" w:line="276"/>
+        <w:jc w:val="left"/>
+      </w:pPr>
+      <w:r>
+        <w:rPr>
+          <w:rFonts w:ascii="Times New Roman" w:hAnsi="Times New Roman" w:eastAsia="Times New Roman" w:cs="Times New Roman"/>
+          <w:rFonts w:ascii="Times New Roman" w:hAnsi="Times New Roman"/>
+          <w:b/>
+          <w:i w:val="0"/>
+          <w:sz w:val="26"/>
+        </w:rPr>
+        <w:t>7.  Results and Evaluation</w:t>
+      </w:r>
+    </w:p>
+    <w:p>
+      <w:pPr>
+        <w:spacing w:before="200" w:after="80" w:lineRule="auto" w:line="276"/>
+        <w:jc w:val="left"/>
+      </w:pPr>
+      <w:r>
+        <w:rPr>
+          <w:rFonts w:ascii="Times New Roman" w:hAnsi="Times New Roman" w:eastAsia="Times New Roman" w:cs="Times New Roman"/>
+          <w:rFonts w:ascii="Times New Roman" w:hAnsi="Times New Roman"/>
+          <w:b/>
+          <w:i w:val="0"/>
+          <w:sz w:val="22"/>
+        </w:rPr>
+        <w:t>7.1  Training Progression</w:t>
       </w:r>
     </w:p>
     <w:p>
@@ -2805,7 +3636,7 @@
           <w:i w:val="0"/>
           <w:sz w:val="22"/>
         </w:rPr>
-        <w:t>6.2  Cross-Dataset Evaluation</w:t>
+        <w:t>7.2  Cross-Dataset Evaluation</w:t>
       </w:r>
     </w:p>
     <w:p>
@@ -3317,7 +4148,7 @@
           <w:i w:val="0"/>
           <w:sz w:val="22"/>
         </w:rPr>
-        <w:t>6.3  Per-Class Performance</w:t>
+        <w:t>7.3  Per-Class Performance</w:t>
       </w:r>
     </w:p>
     <w:p>
@@ -3996,7 +4827,7 @@
           <w:i w:val="0"/>
           <w:sz w:val="26"/>
         </w:rPr>
-        <w:t>7.  Real-World Deployment: Gradio Web Application</w:t>
+        <w:t>8.  Real-World Deployment: Gradio Web Application</w:t>
       </w:r>
     </w:p>
     <w:p>
@@ -4179,7 +5010,7 @@
           <w:i w:val="0"/>
           <w:sz w:val="26"/>
         </w:rPr>
-        <w:t>8.  Discussion</w:t>
+        <w:t>9.  Discussion</w:t>
       </w:r>
     </w:p>
     <w:p>
@@ -4195,7 +5026,7 @@
           <w:i w:val="0"/>
           <w:sz w:val="22"/>
         </w:rPr>
-        <w:t>8.1  Addressing the Five Proposed Goals</w:t>
+        <w:t>9.1  Addressing the Five Proposed Goals</w:t>
       </w:r>
     </w:p>
     <w:p>
@@ -4672,7 +5503,7 @@
           <w:i w:val="0"/>
           <w:sz w:val="22"/>
         </w:rPr>
-        <w:t>8.2  Limitations</w:t>
+        <w:t>9.2  Limitations</w:t>
       </w:r>
     </w:p>
     <w:p>
@@ -4796,7 +5627,7 @@
           <w:i w:val="0"/>
           <w:sz w:val="26"/>
         </w:rPr>
-        <w:t>9.  Conclusion and Future Work</w:t>
+        <w:t>10.  Conclusion and Future Work</w:t>
       </w:r>
     </w:p>
     <w:p>

</xml_diff>

<commit_message>
Final Version of Project
</commit_message>
<xml_diff>
--- a/fer-project/docs/FER_Final_Report.docx
+++ b/fer-project/docs/FER_Final_Report.docx
@@ -126,6 +126,16 @@
           <w:lang w:bidi="my-MM"/>
         </w:rPr>
         <w:t xml:space="preserve"> 4</w:t>
+      </w:r>
+      <w:r>
+        <w:rPr>
+          <w:rFonts w:ascii="Times New Roman" w:eastAsia="Times New Roman" w:hAnsi="Times New Roman" w:cs="Times New Roman" w:hint="cs"/>
+          <w:b/>
+          <w:sz w:val="20"/>
+          <w:cs/>
+          <w:lang w:bidi="my-MM"/>
+        </w:rPr>
+        <w:t xml:space="preserve"> (Nyan Wai Phyo (162236), Yasir Attar(149126)</w:t>
       </w:r>
     </w:p>
     <w:p>

</xml_diff>